<commit_message>
Document verified Render deployment and hosted acceptance checks
</commit_message>
<xml_diff>
--- a/docs/Campus_Care_Internship_Report.docx
+++ b/docs/Campus_Care_Internship_Report.docx
@@ -481,7 +481,7 @@
           <w:rFonts w:ascii="Roboto Condensed" w:cs="Roboto Condensed" w:eastAsia="Roboto Condensed" w:hAnsi="Roboto Condensed"/>
           <w:rtl w:val="0"/>
         </w:rPr>
-        <w:t>The local implementation includes authenticated report management, scoped dashboard statistics, searching, filters, pagination, and responsive views. API integration tests and browser checks provide implementation evidence. The public repository is https://github.com/albertjaison18/campus-care. Cloud deployment remains a delivery task; no hosted URL or institutional adoption is claimed.</w:t>
+        <w:t>The application includes authenticated report management, scoped statistics, searching, filters, pagination, and responsive views. Fourteen local API integration tests passed, followed by hosted browser checks. Source: https://github.com/albertjaison18/campus-care. Live application: https://campus-care-h82p.onrender.com. The project is a demonstration and does not claim institutional adoption.</w:t>
       </w:r>
       <w:r>
         <w:rPr>
@@ -842,7 +842,7 @@
           <w:rFonts w:ascii="Roboto Condensed" w:cs="Roboto Condensed" w:eastAsia="Roboto Condensed" w:hAnsi="Roboto Condensed"/>
           <w:rtl w:val="0"/>
         </w:rPr>
-        <w:t>Deliverables include the React frontend, Express API, MongoDB models, a software requirements specification, API notes, setup instructions, automated integration tests, local screenshots, and this report. A proposed completion target of 6 November 2026 supports planning only and is not an institution-confirmed deadline.</w:t>
+        <w:t>Deliverables include the React frontend, Express API, MongoDB models, a software requirements specification, API notes, setup instructions, automated integration tests, hosted screenshots, and this report. A proposed completion target of 6 November 2026 supports planning only and is not an institution-confirmed deadline.</w:t>
       </w:r>
       <w:r>
         <w:rPr>
@@ -1222,7 +1222,7 @@
           <w:rFonts w:ascii="Roboto Condensed" w:cs="Roboto Condensed" w:eastAsia="Roboto Condensed" w:hAnsi="Roboto Condensed"/>
           <w:rtl w:val="0"/>
         </w:rPr>
-        <w:t>Verification and packaging: compiled the frontend, ran database-backed API tests, exercised the browser workflow, captured screenshots, and documented production configuration. A production database and live deployment still require hosting setup. The project repository is https://github.com/albertjaison18/campus-care.</w:t>
+        <w:t>Verification and publication: compiled the frontend, passed database-backed API tests, published the source on GitHub, configured a database-scoped Atlas user, deployed on Render Free, repeated the hosted browser journey, and captured its major views. Credentials remain outside source control.</w:t>
       </w:r>
       <w:r>
         <w:rPr>
@@ -1319,7 +1319,7 @@
           <w:rFonts w:ascii="Roboto Condensed" w:cs="Roboto Condensed" w:eastAsia="Roboto Condensed" w:hAnsi="Roboto Condensed"/>
           <w:rtl w:val="0"/>
         </w:rPr>
-        <w:t>Browser checks confirmed student registration, report creation, commenting, administrator sign-in, assignment, Open-to-In-progress-to-Resolved updates, pagination, status filtering, search empty states, and narrow-screen navigation labels. Screenshots show local demonstration data. The production build completed successfully.</w:t>
+        <w:t>Hosted browser checks confirmed registration, report creation, comments, persistence after refresh, administrator sign-in, assignment, Open-to-In-progress-to-Resolved updates, filters, search empty states, and logout. Desktop and 390-pixel mobile layouts passed. Screenshots show fictional hosted demonstration data. Local checks also covered pagination.</w:t>
       </w:r>
       <w:r>
         <w:rPr>
@@ -1350,7 +1350,7 @@
           <w:rFonts w:ascii="Roboto Condensed" w:cs="Roboto Condensed" w:eastAsia="Roboto Condensed" w:hAnsi="Roboto Condensed"/>
           <w:rtl w:val="0"/>
         </w:rPr>
-        <w:t>The results demonstrate implementation correctness for the tested local flows, not institutional effectiveness, production performance, or security certification. Cloud availability, concurrent user performance, and the full live acceptance journey remain unverified until deployment.</w:t>
+        <w:t>The live health check returned 200, anonymous access returned 401, and the admin session used Secure, HttpOnly and SameSite=Lax cookies. Tested flows passed; long-term uptime, institutional effectiveness, concurrent performance and independent security certification remain unverified. Free hosting can pause idle instances.</w:t>
       </w:r>
       <w:r>
         <w:rPr>
@@ -1416,7 +1416,7 @@
           <w:rFonts w:ascii="Roboto Condensed" w:cs="Roboto Condensed" w:eastAsia="Roboto Condensed" w:hAnsi="Roboto Condensed"/>
           <w:rtl w:val="0"/>
         </w:rPr>
-        <w:t>Campus Care connects a practical reporting interface with a validated API and persisted MongoDB records. Its ownership checks and status history make the intended student and administrator responsibilities explicit. Local testing confirms the core report-to-resolution workflow.</w:t>
+        <w:t>Campus Care connects a practical reporting interface with a validated API and persisted MongoDB records. Its ownership checks and status history make the intended student and administrator responsibilities explicit. Local and hosted checks confirm the tested report-to-resolution workflow.</w:t>
       </w:r>
       <w:r>
         <w:rPr>
@@ -1447,7 +1447,7 @@
           <w:rFonts w:ascii="Roboto Condensed" w:cs="Roboto Condensed" w:eastAsia="Roboto Condensed" w:hAnsi="Roboto Condensed"/>
           <w:rtl w:val="0"/>
         </w:rPr>
-        <w:t>Completion for submission requires a publicly accessible GitHub repository, a hosted HTTPS application with an external database, live acceptance testing, and verified links in the report. Future improvements could add verified college membership, password recovery, attachments, staff accounts, notification delivery, and archival of long activity histories.</w:t>
+        <w:t>The repository, HTTPS application, external database, hosted checks and supporting documents are prepared. Student review, explanation practice, confirmation of the official deadline, and uploading to the assignment portal remain. Future work could add verified college membership, password recovery, attachments, staff accounts, notifications and activity archiving.</w:t>
       </w:r>
       <w:r>
         <w:rPr>
@@ -1544,7 +1544,7 @@
           <w:rFonts w:ascii="Roboto Condensed" w:cs="Roboto Condensed" w:eastAsia="Roboto Condensed" w:hAnsi="Roboto Condensed"/>
           <w:rtl w:val="0"/>
         </w:rPr>
-        <w:t>Repository: https://github.com/albertjaison18/campus-care. A hosted application URL has not yet been created. The README contains setup and deployment steps. The live URL and production acceptance results must be added before final submission.</w:t>
+        <w:t>Repository: https://github.com/albertjaison18/campus-care. Live application: https://campus-care-h82p.onrender.com. Verified on 23 October 2026 using Render Free and MongoDB Atlas Free. The README contains setup instructions; docs/TEST_RESULTS.md distinguishes local tests from hosted checks. Administrator credentials are not included in the submission.</w:t>
       </w:r>
       <w:r>
         <w:rPr>
@@ -1608,7 +1608,7 @@
         </w:rPr>
         <w:drawing>
           <wp:inline>
-            <wp:extent cx="5852160" cy="4064000"/>
+            <wp:extent cx="5852160" cy="3486912"/>
             <wp:docPr id="2" name="Picture 2"/>
             <wp:cNvGraphicFramePr>
               <a:graphicFrameLocks noChangeAspect="1"/>
@@ -1629,7 +1629,7 @@
                   <pic:spPr>
                     <a:xfrm>
                       <a:off x="0" y="0"/>
-                      <a:ext cx="5852160" cy="4064000"/>
+                      <a:ext cx="5852160" cy="3486912"/>
                     </a:xfrm>
                     <a:prstGeom prst="rect"/>
                   </pic:spPr>
@@ -1701,7 +1701,7 @@
         </w:rPr>
         <w:drawing>
           <wp:inline>
-            <wp:extent cx="5852160" cy="6246688"/>
+            <wp:extent cx="5852160" cy="3486655"/>
             <wp:docPr id="3" name="Picture 3"/>
             <wp:cNvGraphicFramePr>
               <a:graphicFrameLocks noChangeAspect="1"/>
@@ -1722,7 +1722,7 @@
                   <pic:spPr>
                     <a:xfrm>
                       <a:off x="0" y="0"/>
-                      <a:ext cx="5852160" cy="6246688"/>
+                      <a:ext cx="5852160" cy="3486655"/>
                     </a:xfrm>
                     <a:prstGeom prst="rect"/>
                   </pic:spPr>
@@ -1854,7 +1854,7 @@
           <w:rFonts w:ascii="Roboto Condensed" w:cs="Roboto Condensed" w:eastAsia="Roboto Condensed" w:hAnsi="Roboto Condensed"/>
           <w:rtl w:val="0"/>
         </w:rPr>
-        <w:t>Figure 4  Assignment status and activity history</w:t>
+        <w:t>Figure 4  Resolved status and team assignment</w:t>
       </w:r>
       <w:r>
         <w:rPr>
@@ -1980,7 +1980,7 @@
         </w:rPr>
         <w:drawing>
           <wp:inline>
-            <wp:extent cx="2834640" cy="6130381"/>
+            <wp:extent cx="2834640" cy="6127183"/>
             <wp:docPr id="6" name="Picture 6"/>
             <wp:cNvGraphicFramePr>
               <a:graphicFrameLocks noChangeAspect="1"/>
@@ -2001,7 +2001,7 @@
                   <pic:spPr>
                     <a:xfrm>
                       <a:off x="0" y="0"/>
-                      <a:ext cx="2834640" cy="6130381"/>
+                      <a:ext cx="2834640" cy="6127183"/>
                     </a:xfrm>
                     <a:prstGeom prst="rect"/>
                   </pic:spPr>

</xml_diff>